<commit_message>
Add PDF version of porfolio
</commit_message>
<xml_diff>
--- a/writing samples.docx
+++ b/writing samples.docx
@@ -68,13 +68,13 @@
       <w:r>
         <w:fldChar w:fldCharType="separate"/>
       </w:r>
-      <w:hyperlink w:anchor="_Toc214008531" w:history="1">
+      <w:hyperlink w:anchor="_Toc214008955" w:history="1">
         <w:r>
           <w:rPr>
             <w:rStyle w:val="Hyperlink"/>
             <w:noProof/>
           </w:rPr>
-          <w:t>Portfolio Location</w:t>
+          <w:t>Writing Sample Portfolio Location</w:t>
         </w:r>
         <w:r>
           <w:rPr>
@@ -95,7 +95,7 @@
             <w:noProof/>
             <w:webHidden/>
           </w:rPr>
-          <w:instrText xml:space="preserve"> PAGEREF _Toc214008531 \h </w:instrText>
+          <w:instrText xml:space="preserve"> PAGEREF _Toc214008955 \h </w:instrText>
         </w:r>
         <w:r>
           <w:rPr>
@@ -137,7 +137,7 @@
           <w:noProof/>
         </w:rPr>
       </w:pPr>
-      <w:hyperlink w:anchor="_Toc214008532" w:history="1">
+      <w:hyperlink w:anchor="_Toc214008956" w:history="1">
         <w:r>
           <w:rPr>
             <w:rStyle w:val="Hyperlink"/>
@@ -164,7 +164,7 @@
             <w:noProof/>
             <w:webHidden/>
           </w:rPr>
-          <w:instrText xml:space="preserve"> PAGEREF _Toc214008532 \h </w:instrText>
+          <w:instrText xml:space="preserve"> PAGEREF _Toc214008956 \h </w:instrText>
         </w:r>
         <w:r>
           <w:rPr>
@@ -206,7 +206,7 @@
           <w:noProof/>
         </w:rPr>
       </w:pPr>
-      <w:hyperlink w:anchor="_Toc214008533" w:history="1">
+      <w:hyperlink w:anchor="_Toc214008957" w:history="1">
         <w:r>
           <w:rPr>
             <w:rStyle w:val="Hyperlink"/>
@@ -233,7 +233,7 @@
             <w:noProof/>
             <w:webHidden/>
           </w:rPr>
-          <w:instrText xml:space="preserve"> PAGEREF _Toc214008533 \h </w:instrText>
+          <w:instrText xml:space="preserve"> PAGEREF _Toc214008957 \h </w:instrText>
         </w:r>
         <w:r>
           <w:rPr>
@@ -275,7 +275,7 @@
           <w:noProof/>
         </w:rPr>
       </w:pPr>
-      <w:hyperlink w:anchor="_Toc214008534" w:history="1">
+      <w:hyperlink w:anchor="_Toc214008958" w:history="1">
         <w:r>
           <w:rPr>
             <w:rStyle w:val="Hyperlink"/>
@@ -302,7 +302,7 @@
             <w:noProof/>
             <w:webHidden/>
           </w:rPr>
-          <w:instrText xml:space="preserve"> PAGEREF _Toc214008534 \h </w:instrText>
+          <w:instrText xml:space="preserve"> PAGEREF _Toc214008958 \h </w:instrText>
         </w:r>
         <w:r>
           <w:rPr>
@@ -344,7 +344,7 @@
           <w:noProof/>
         </w:rPr>
       </w:pPr>
-      <w:hyperlink w:anchor="_Toc214008535" w:history="1">
+      <w:hyperlink w:anchor="_Toc214008959" w:history="1">
         <w:r>
           <w:rPr>
             <w:rStyle w:val="Hyperlink"/>
@@ -371,7 +371,7 @@
             <w:noProof/>
             <w:webHidden/>
           </w:rPr>
-          <w:instrText xml:space="preserve"> PAGEREF _Toc214008535 \h </w:instrText>
+          <w:instrText xml:space="preserve"> PAGEREF _Toc214008959 \h </w:instrText>
         </w:r>
         <w:r>
           <w:rPr>
@@ -413,13 +413,13 @@
           <w:noProof/>
         </w:rPr>
       </w:pPr>
-      <w:hyperlink w:anchor="_Toc214008536" w:history="1">
+      <w:hyperlink w:anchor="_Toc214008960" w:history="1">
         <w:r>
           <w:rPr>
             <w:rStyle w:val="Hyperlink"/>
             <w:noProof/>
           </w:rPr>
-          <w:t>Example 5 – Compiler Developer Guide Overview</w:t>
+          <w:t>Example 5 – C++ Compiler Developer Guide Overview</w:t>
         </w:r>
         <w:r>
           <w:rPr>
@@ -440,7 +440,7 @@
             <w:noProof/>
             <w:webHidden/>
           </w:rPr>
-          <w:instrText xml:space="preserve"> PAGEREF _Toc214008536 \h </w:instrText>
+          <w:instrText xml:space="preserve"> PAGEREF _Toc214008960 \h </w:instrText>
         </w:r>
         <w:r>
           <w:rPr>
@@ -483,7 +483,10 @@
       <w:pPr>
         <w:pStyle w:val="Heading1"/>
       </w:pPr>
-      <w:bookmarkStart w:id="0" w:name="_Toc214008531"/>
+      <w:bookmarkStart w:id="0" w:name="_Toc214008955"/>
+      <w:r>
+        <w:t xml:space="preserve">Writing Sample </w:t>
+      </w:r>
       <w:r>
         <w:t xml:space="preserve">Portfolio </w:t>
       </w:r>
@@ -494,18 +497,34 @@
     </w:p>
     <w:p>
       <w:r>
-        <w:t xml:space="preserve">This sample file is available from </w:t>
+        <w:t xml:space="preserve">This </w:t>
+      </w:r>
+      <w:r>
+        <w:t>portfolio</w:t>
+      </w:r>
+      <w:r>
+        <w:t xml:space="preserve"> file is available from </w:t>
       </w:r>
       <w:hyperlink r:id="rId8" w:history="1">
         <w:r>
           <w:rPr>
             <w:rStyle w:val="Hyperlink"/>
           </w:rPr>
-          <w:t>https://github.com/johnkinsky/book/blob/main/writing%20samples.docx</w:t>
+          <w:t>https://github.com/johnkinsky/book/blob/main/writing_samples.pdf</w:t>
         </w:r>
       </w:hyperlink>
       <w:r>
-        <w:t xml:space="preserve">. My GitHub repo </w:t>
+        <w:t xml:space="preserve">. </w:t>
+      </w:r>
+    </w:p>
+    <w:p>
+      <w:r>
+        <w:t>I’ve included a link to the original source for each example and I’ve included some context to explain the reason for the sample and how the writing impacted the developer audience.</w:t>
+      </w:r>
+    </w:p>
+    <w:p>
+      <w:r>
+        <w:t xml:space="preserve">My GitHub repo </w:t>
       </w:r>
       <w:r>
         <w:t>(</w:t>
@@ -543,7 +562,7 @@
       <w:pPr>
         <w:pStyle w:val="Heading1"/>
       </w:pPr>
-      <w:bookmarkStart w:id="1" w:name="_Toc214008532"/>
+      <w:bookmarkStart w:id="1" w:name="_Toc214008956"/>
       <w:r>
         <w:lastRenderedPageBreak/>
         <w:t xml:space="preserve">Example 1 – Blog </w:t>
@@ -2187,7 +2206,7 @@
       <w:pPr>
         <w:pStyle w:val="Heading1"/>
       </w:pPr>
-      <w:bookmarkStart w:id="2" w:name="_Toc214008533"/>
+      <w:bookmarkStart w:id="2" w:name="_Toc214008957"/>
       <w:r>
         <w:lastRenderedPageBreak/>
         <w:t xml:space="preserve">Example </w:t>
@@ -3713,7 +3732,7 @@
       <w:pPr>
         <w:pStyle w:val="Heading1"/>
       </w:pPr>
-      <w:bookmarkStart w:id="3" w:name="_Toc214008534"/>
+      <w:bookmarkStart w:id="3" w:name="_Toc214008958"/>
       <w:r>
         <w:lastRenderedPageBreak/>
         <w:t xml:space="preserve">Example </w:t>
@@ -5395,7 +5414,7 @@
       <w:pPr>
         <w:pStyle w:val="Heading1"/>
       </w:pPr>
-      <w:bookmarkStart w:id="4" w:name="_Toc214008535"/>
+      <w:bookmarkStart w:id="4" w:name="_Toc214008959"/>
       <w:r>
         <w:lastRenderedPageBreak/>
         <w:t xml:space="preserve">Example </w:t>
@@ -7458,7 +7477,7 @@
       <w:pPr>
         <w:pStyle w:val="Heading1"/>
       </w:pPr>
-      <w:bookmarkStart w:id="5" w:name="_Toc214008536"/>
+      <w:bookmarkStart w:id="5" w:name="_Toc214008960"/>
       <w:r>
         <w:lastRenderedPageBreak/>
         <w:t xml:space="preserve">Example 5 – </w:t>

</xml_diff>